<commit_message>
CAR Mujeres: correcciones de coherencia en memoria de calculo, memoria hidrologica y memoria descriptiva
Co-Authored-By: Claude Opus 5.5 <noreply@anthropic.com>
Claude-Session: https://claude.ai/code/session_0142t8T16igb3VKxUPwnQPq6
</commit_message>
<xml_diff>
--- a/entregables_mujeres/MEMORIA_DESCRIPTIVA_DRENAJE_PLUVIAL_CAR_MUJERES.docx
+++ b/entregables_mujeres/MEMORIA_DESCRIPTIVA_DRENAJE_PLUVIAL_CAR_MUJERES.docx
@@ -13901,7 +13901,7 @@
           <w:szCs w:val="22"/>
           <w:lang w:val="es-PE"/>
         </w:rPr>
-        <w:t xml:space="preserve"> en todo el recorrido (número de Froude de 0.52 a 0.74), con velocidades de 1.13 a 1.43 m/s, un llenado máximo de 81.5 % de la altura interior y un borde libre mínimo de 0.087 m.</w:t>
+        <w:t xml:space="preserve"> en todo el recorrido (número de Froude de 0.51 a 0.74), con velocidades de 1.02 a 1.43 m/s, un llenado máximo de 81.5 % de la altura interior y un borde libre mínimo de 0.087 m en el Eje 02. En el cruce de camiones (0+054.00 a 0+060.00) la cara inferior de la losa desciende 0.10 m por su mayor espesor y el borde libre mínimo es de 0.091 m.</w:t>
       </w:r>
     </w:p>
     <w:p>
@@ -14707,6 +14707,29 @@
           <w:lang w:val="es-PE"/>
         </w:rPr>
         <w:t xml:space="preserve">La descarga se resuelve con dos aleros de concreto armado f'c = 210 kg/cm² a 45° (e = 0.15 m, longitud 1.00 m y altura de 0.70 m en el cabezal a 0.45 m en el extremo), monolíticos con el extremo del colector; un emboquillado de piedra de 0.20 m de espesor con concreto f'c = 140 kg/cm² entre los aleros; y una uña de concreto ciclópeo f'c = 140 kg/cm² + 30 % P.M. de 0.35 m × 0.65 m en el extremo, que protege la estructura contra la socavación. Los últimos 4.00 m del colector se desvían 0.85 m hacia el interior para que toda la estructura quede dentro del lindero. El detalle se presenta en la lámina ESDAE-01.</w:t>
+      </w:r>
+    </w:p>
+    <w:p>
+      <w:pPr>
+        <w:spacing w:after="240" w:line="276" w:lineRule="auto"/>
+        <w:jc w:val="both"/>
+        <w:rPr>
+          <w:rFonts w:ascii="Swis721 Cn BT" w:hAnsi="Swis721 Cn BT" w:cs="Calibri Light"/>
+          <w:color w:val="000000" w:themeColor="text1"/>
+          <w:sz w:val="22"/>
+          <w:szCs w:val="22"/>
+          <w:lang w:val="es-PE"/>
+        </w:rPr>
+      </w:pPr>
+      <w:r>
+        <w:rPr>
+          <w:rFonts w:ascii="Swis721 Cn BT" w:hAnsi="Swis721 Cn BT" w:cs="Calibri Light"/>
+          <w:color w:val="000000" w:themeColor="text1"/>
+          <w:sz w:val="22"/>
+          <w:szCs w:val="22"/>
+          <w:lang w:val="es-PE"/>
+        </w:rPr>
+        <w:t xml:space="preserve">El cruce de las aguas hacia el otro lado de la Carretera Oasis (badén o alcantarilla) queda fuera del alcance del presente proyecto, que entrega el caudal sobre la berma dentro del lindero; su solución corresponde a la entidad a cargo de la vía.</w:t>
       </w:r>
     </w:p>
     <w:p>
@@ -22723,6 +22746,30 @@
           <w:szCs w:val="22"/>
         </w:rPr>
         <w:t xml:space="preserve">Confirmar el ingreso de camiones por el acceso secundario, condición considerada en el diseño de la sección reforzada del colector.</w:t>
+      </w:r>
+    </w:p>
+    <w:p>
+      <w:pPr>
+        <w:numPr>
+          <w:ilvl w:val="0"/>
+          <w:numId w:val="2"/>
+        </w:numPr>
+        <w:jc w:val="both"/>
+        <w:rPr>
+          <w:rFonts w:ascii="Swis721 Cn BT" w:hAnsi="Swis721 Cn BT" w:cs="Calibri Light"/>
+          <w:color w:val="000000" w:themeColor="text1"/>
+          <w:sz w:val="22"/>
+          <w:szCs w:val="22"/>
+        </w:rPr>
+      </w:pPr>
+      <w:r>
+        <w:rPr>
+          <w:rFonts w:ascii="Swis721 Cn BT" w:hAnsi="Swis721 Cn BT" w:cs="Calibri Light"/>
+          <w:color w:val="000000" w:themeColor="text1"/>
+          <w:sz w:val="22"/>
+          <w:szCs w:val="22"/>
+        </w:rPr>
+        <w:t xml:space="preserve">Comunicar a la entidad a cargo de la Carretera Oasis el caudal de entrega (822.9 L/s) y el punto de descarga, para que evalúe el cruce de las aguas bajo o sobre la vía (badén o alcantarilla), que queda fuera del alcance del proyecto.</w:t>
       </w:r>
     </w:p>
     <w:p>

</xml_diff>